<commit_message>
Unify placeholders across all 5 templates
Templates 2-5 were edited from their PTT-issued state to expose the
same named placeholders form 1 uses (Vendor, ชื่องาน, PO_No), so the
app auto-fills the same fields across all five forms instead of
leaving forms 2-5 mostly blank. form_logic.py: collapsed the per-form
constants into shared ones; PO/Vendor/work_title fill happens in a
single block after the form-specific branches. Adds project-level
CLAUDE.md documenting the two-UI architecture and the placeholder
schemes, plus the Dockerfile that had been only on local.

Co-Authored-By: Claude Opus 4.7 (1M context) <noreply@anthropic.com>
</commit_message>
<xml_diff>
--- a/templates/form2.docx
+++ b/templates/form2.docx
@@ -310,15 +310,14 @@
           <w:sz w:val="28"/>
           <w:cs/>
         </w:rPr>
-        <w:t>[</w:t>
-      </w:r>
-      <w:r>
-        <w:rPr>
-          <w:rFonts w:asciiTheme="minorBidi" w:hAnsiTheme="minorBidi" w:hint="cs"/>
-          <w:sz w:val="28"/>
-          <w:cs/>
-        </w:rPr>
-        <w:t>ระบุชื่อคู่สัญญา</w:t>
+        <w:t>Vendor</w:t>
+      </w:r>
+      <w:r>
+        <w:rPr>
+          <w:rFonts w:asciiTheme="minorBidi" w:hAnsiTheme="minorBidi" w:hint="cs"/>
+          <w:sz w:val="28"/>
+          <w:cs/>
+        </w:rPr>
       </w:r>
       <w:r>
         <w:rPr>
@@ -326,7 +325,7 @@
           <w:sz w:val="28"/>
           <w:cs/>
         </w:rPr>
-        <w:t xml:space="preserve">] </w:t>
+        <w:t xml:space="preserve"> </w:t>
       </w:r>
     </w:p>
     <w:p>
@@ -435,15 +434,14 @@
           <w:cs/>
         </w:rPr>
         <w:tab/>
-        <w:t xml:space="preserve">    ใ</w:t>
-      </w:r>
-      <w:r>
-        <w:rPr>
-          <w:rFonts w:asciiTheme="minorBidi" w:hAnsiTheme="minorBidi" w:hint="cs"/>
-          <w:sz w:val="28"/>
-          <w:cs/>
-        </w:rPr>
-        <w:t xml:space="preserve">บสั่งซื้อ/จ้าง </w:t>
+        <w:t xml:space="preserve">    ใบสั่งซื้อ/จ้าง เลขที่ PO_No </w:t>
+      </w:r>
+      <w:r>
+        <w:rPr>
+          <w:rFonts w:asciiTheme="minorBidi" w:hAnsiTheme="minorBidi" w:hint="cs"/>
+          <w:sz w:val="28"/>
+          <w:cs/>
+        </w:rPr>
       </w:r>
       <w:r>
         <w:rPr>
@@ -451,15 +449,14 @@
           <w:sz w:val="28"/>
           <w:cs/>
         </w:rPr>
-        <w:t>เลขที่</w:t>
-      </w:r>
-      <w:r>
-        <w:rPr>
-          <w:rFonts w:asciiTheme="minorBidi" w:hAnsiTheme="minorBidi" w:hint="cs"/>
-          <w:sz w:val="28"/>
-          <w:cs/>
-        </w:rPr>
-        <w:t>................ลงวันที่...............................</w:t>
+      </w:r>
+      <w:r>
+        <w:rPr>
+          <w:rFonts w:asciiTheme="minorBidi" w:hAnsiTheme="minorBidi" w:hint="cs"/>
+          <w:sz w:val="28"/>
+          <w:cs/>
+        </w:rPr>
+        <w:t>ลงวันที่...............................</w:t>
       </w:r>
       <w:r>
         <w:rPr>
@@ -735,7 +732,7 @@
           <w:sz w:val="28"/>
           <w:cs/>
         </w:rPr>
-        <w:t>......(</w:t>
+        <w:t xml:space="preserve">Vendor </w:t>
       </w:r>
       <w:r>
         <w:rPr>
@@ -743,7 +740,6 @@
           <w:sz w:val="28"/>
           <w:cs/>
         </w:rPr>
-        <w:t>ระบุชื่อคู่สัญญา</w:t>
       </w:r>
       <w:r>
         <w:rPr>
@@ -753,7 +749,6 @@
           <w:sz w:val="28"/>
           <w:cs/>
         </w:rPr>
-        <w:t>)</w:t>
       </w:r>
       <w:r>
         <w:rPr>
@@ -761,7 +756,7 @@
           <w:sz w:val="28"/>
           <w:cs/>
         </w:rPr>
-        <w:t>.....ได้ตกลงทำ</w:t>
+        <w:t>ได้ตกลงทำ</w:t>
       </w:r>
       <w:r>
         <w:rPr>
@@ -864,7 +859,7 @@
           <w:sz w:val="28"/>
           <w:cs/>
         </w:rPr>
-        <w:t>...</w:t>
+        <w:t xml:space="preserve"> ชื่องาน</w:t>
       </w:r>
       <w:r>
         <w:rPr>
@@ -872,7 +867,6 @@
           <w:sz w:val="28"/>
           <w:cs/>
         </w:rPr>
-        <w:t>.(โปรดระบุวัตถุประสงค์)......</w:t>
       </w:r>
       <w:r>
         <w:rPr>

</xml_diff>